<commit_message>
Abstract trimmed to 285 words; supplementary captions carry panel letters
- abstract reduced from 450 to 285 words, within the limit of the realistic target
  journals, with the argument preserved and the numeric clauses broken up
- all 23 supplementary figure captions rewritten to name each panel, which became
  necessary when baked-in titles were removed from the artwork
- three genuinely single-panel figures are correctly left unlettered
- three figures added to the supplementary that were cited in the text but not
  previously listed: equivalence testing, the readout-channel permutation null, and
  the crystallisability control

Co-Authored-By: Claude Opus 5 <noreply@anthropic.com>
</commit_message>
<xml_diff>
--- a/manuscript/SUPPLEMENTARY.docx
+++ b/manuscript/SUPPLEMENTARY.docx
@@ -7532,7 +7532,7 @@
         <w:rPr>
           <w:sz w:val="18"/>
         </w:rPr>
-        <w:t>Fig. S1 Chemical-class collapse of the recognition matrices.</w:t>
+        <w:t>Fig. S1 Chemical-class collapse of the recognition matrices. (a) Antibody-antigen. (b) General protein-protein. Cell values are log2(observed/expected).</w:t>
       </w:r>
     </w:p>
     <w:p>
@@ -7582,7 +7582,7 @@
         <w:rPr>
           <w:sz w:val="18"/>
         </w:rPr>
-        <w:t>Fig. S2 Recognition matrices decomposed by bond type.</w:t>
+        <w:t>Fig. S2 Recognition matrices decomposed by bond type. (a) to (d) Antibody-antigen, showing salt bridge, hydrogen bond, van der Waals and aromatic stacking respectively. (e) to (h) The same four decompositions for general protein-protein interfaces.</w:t>
       </w:r>
     </w:p>
     <w:p>
@@ -7632,7 +7632,7 @@
         <w:rPr>
           <w:sz w:val="18"/>
         </w:rPr>
-        <w:t>Fig. S3 Recognition matrices using UniProt accession as the independence unit, as a sensitivity analysis.</w:t>
+        <w:t>Fig. S3 Recognition matrices computed with UniProt accession as the independence unit, as a sensitivity analysis on the cluster30 definition used throughout. (a) Antibody-antigen. (b) General protein-protein.</w:t>
       </w:r>
     </w:p>
     <w:p>
@@ -7682,7 +7682,7 @@
         <w:rPr>
           <w:sz w:val="18"/>
         </w:rPr>
-        <w:t>Fig. S4 Cell-by-cell agreement between the two grammars and classification of shared and specific cells.</w:t>
+        <w:t>Fig. S4 Conservation of recognition chemistry between the two classes. (a) Cell-by-cell agreement, coloured by the chemical class of the probe residue. (b) Correlation by bond type, with and without cysteine. (c) Classification of cells as universal, class-specific or opposed.</w:t>
       </w:r>
     </w:p>
     <w:p>
@@ -7732,7 +7732,7 @@
         <w:rPr>
           <w:sz w:val="18"/>
         </w:rPr>
-        <w:t>Fig. S5 Functional-group recognition maps and their difference.</w:t>
+        <w:t>Fig. S5 Functional-group recognition maps over fourteen chemical groups. (a) Antibody-antigen. (b) General protein-protein. (c) Difference between them, with orange indicating antibody enrichment.</w:t>
       </w:r>
     </w:p>
     <w:p>
@@ -7782,7 +7782,7 @@
         <w:rPr>
           <w:sz w:val="18"/>
         </w:rPr>
-        <w:t>Fig. S6 CATH fold composition and the fold-matched control.</w:t>
+        <w:t>Fig. S6 Fold composition and the fold-matched control. (a) CATH class of the recognised protein in each group. (b) Cross-class grammar correlation within matched fold class, against size-matched nulls shown in grey.</w:t>
       </w:r>
     </w:p>
     <w:p>
@@ -7832,7 +7832,7 @@
         <w:rPr>
           <w:sz w:val="18"/>
         </w:rPr>
-        <w:t>Fig. S7 Resolution, redundancy, hydrogen-bond criterion and antibody-format controls.</w:t>
+        <w:t>Fig. S7 Robustness controls. (a) Resolution stratification against size-matched nulls. (b) Effect of removing the largest antigen clusters. (c) Sensitivity to the hydrogen-bond distance criterion. (d) Fab against single-domain antibodies, with the within-format reliability ceiling.</w:t>
       </w:r>
     </w:p>
     <w:p>
@@ -7882,7 +7882,7 @@
         <w:rPr>
           <w:sz w:val="18"/>
         </w:rPr>
-        <w:t>Fig. S8 Differential map, permutation test and matrix asymmetry.</w:t>
+        <w:t>Fig. S8 Formal comparison of the two grammars. (a) Differential map, antibody minus protein-protein, with dots marking cells whose interval excludes zero. (b) Permutation test against the null of one shared grammar. (c) Matrix asymmetry for each class.</w:t>
       </w:r>
     </w:p>
     <w:p>
@@ -7932,7 +7932,7 @@
         <w:rPr>
           <w:sz w:val="18"/>
         </w:rPr>
-        <w:t>Fig. S9 Paratope architecture and epitope contiguity.</w:t>
+        <w:t>Fig. S9 Paratope architecture and epitope character. (a) Share of paratope contacts by CDR loop and framework, split by construct type. (b) Paratope residue enrichment scored against two backgrounds. (c) Number of sequence segments per epitope.</w:t>
       </w:r>
     </w:p>
     <w:p>
@@ -7982,7 +7982,7 @@
         <w:rPr>
           <w:sz w:val="18"/>
         </w:rPr>
-        <w:t>Fig. S10 Post-translational modifications and glycans at interfaces.</w:t>
+        <w:t>Fig. S10 Modified residues and glycans at interfaces. (a) Post-translational modifications. (b) Glycans. Bars give the fraction of structures with at least one such group contacting the partner.</w:t>
       </w:r>
     </w:p>
     <w:p>
@@ -8032,7 +8032,7 @@
         <w:rPr>
           <w:sz w:val="18"/>
         </w:rPr>
-        <w:t>Fig. S11 Native-versus-decoy discrimination with self and cross potentials.</w:t>
+        <w:t>Fig. S11 Native-versus-decoy discrimination using each matrix as a threading potential. (a) Antibody interfaces scored by the antibody potential under leave-one-unit-out validation and by the protein-protein potential. (b) The equivalent comparison for protein-protein interfaces.</w:t>
       </w:r>
     </w:p>
     <w:p>
@@ -8082,7 +8082,7 @@
         <w:rPr>
           <w:sz w:val="18"/>
         </w:rPr>
-        <w:t>Fig. S12 Burial thermodynamics.</w:t>
+        <w:t>Fig. S12 Burial thermodynamics from atom-level solvent accessibility. (a) Fraction of buried surface that is apolar. (b) Heat-capacity change per 1000 square angstroms buried. (c) Total buried surface. Distributions are over cluster30 units.</w:t>
       </w:r>
     </w:p>
     <w:p>
@@ -8132,7 +8132,7 @@
         <w:rPr>
           <w:sz w:val="18"/>
         </w:rPr>
-        <w:t>Fig. S13 Shape complementarity.</w:t>
+        <w:t>Fig. S13 Shape complementarity of the two interface classes, computed on the van der Waals contact surface. Values are not directly comparable with published figures because re-entrant surface is omitted; the between-class comparison is internally valid.</w:t>
       </w:r>
     </w:p>
     <w:p>
@@ -8182,7 +8182,7 @@
         <w:rPr>
           <w:sz w:val="18"/>
         </w:rPr>
-        <w:t>Fig. S14 Geometric spread of paratope and epitope.</w:t>
+        <w:t>Fig. S14 Geometric spread of the contacted patch. (a) to (c) Probe side: radius of gyration, planarity, and number of spatially separate sub-patches. (d) to (f) The same three quantities for the target side.</w:t>
       </w:r>
     </w:p>
     <w:p>
@@ -8232,7 +8232,7 @@
         <w:rPr>
           <w:sz w:val="18"/>
         </w:rPr>
-        <w:t>Fig. S15 Overlap of interfaces with ligand-binding sites.</w:t>
+        <w:t>Fig. S15 Overlap between interfaces and ligand-binding sites. (a) Fraction of interface residues lying within a ligand-binding site. (b) Ligands most often defining those sites.</w:t>
       </w:r>
     </w:p>
     <w:p>
@@ -8282,7 +8282,7 @@
         <w:rPr>
           <w:sz w:val="18"/>
         </w:rPr>
-        <w:t>Fig. S16 Backbone dihedrals, side-chain rotamers and burial.</w:t>
+        <w:t>Fig. S16 Backbone dihedrals, side-chain rotamers and burial. (a) to (c) Antibody-antigen: Ramachandran distribution of interface residues, chi1 for interface against background, and buried surface per residue. (d) to (f) The same three for general protein-protein interfaces.</w:t>
       </w:r>
     </w:p>
     <w:p>
@@ -8332,7 +8332,7 @@
         <w:rPr>
           <w:sz w:val="18"/>
         </w:rPr>
-        <w:t>Fig. S17 Per-position antibody contact frequency on lysozyme C.</w:t>
+        <w:t>Fig. S17 Per-position contact frequency across 42 independently raised antibodies against lysozyme C, in canonical numbering. Labelled positions are the eight most frequently contacted.</w:t>
       </w:r>
     </w:p>
     <w:p>
@@ -8382,7 +8382,7 @@
         <w:rPr>
           <w:sz w:val="18"/>
         </w:rPr>
-        <w:t>Fig. S18 Immunodominance and sequence conservation on lysozyme C.</w:t>
+        <w:t>Fig. S18 Lysozyme C case study. (a) Fraction of the 42 antibodies contacting each position, with catalytic residues marked by dashed lines. (b) Sequence conservation at each position from 236 aligned UniRef50 homologues.</w:t>
       </w:r>
     </w:p>
     <w:p>
@@ -8432,7 +8432,7 @@
         <w:rPr>
           <w:sz w:val="18"/>
         </w:rPr>
-        <w:t>Fig. S19 Epitope overlap with the natural partner site for proteins solved in both complexes.</w:t>
+        <w:t>Fig. S19 Proteins solved both with an antibody and with a natural partner. (a) Distribution of Jaccard overlap between the epitope and the partner site across 16 matched proteins. (b) The highest-overlap pairs individually.</w:t>
       </w:r>
     </w:p>
     <w:p>
@@ -8482,7 +8482,157 @@
         <w:rPr>
           <w:sz w:val="18"/>
         </w:rPr>
-        <w:t>Fig. S20 Interface size and packing distributions.</w:t>
+        <w:t>Fig. S20 Interface size and packing. (a) to (f) Residue pairs per interface, interface residues on each side, atom contacts, contacts per probe residue, and mean closest-approach distance. Distributions are over cluster30 units.</w:t>
+      </w:r>
+    </w:p>
+    <w:p>
+      <w:pPr>
+        <w:jc w:val="center"/>
+      </w:pPr>
+      <w:r>
+        <w:drawing>
+          <wp:inline xmlns:a="http://schemas.openxmlformats.org/drawingml/2006/main" xmlns:pic="http://schemas.openxmlformats.org/drawingml/2006/picture">
+            <wp:extent cx="5394960" cy="2744804"/>
+            <wp:docPr id="21" name="Picture 21"/>
+            <wp:cNvGraphicFramePr>
+              <a:graphicFrameLocks noChangeAspect="1"/>
+            </wp:cNvGraphicFramePr>
+            <a:graphic>
+              <a:graphicData uri="http://schemas.openxmlformats.org/drawingml/2006/picture">
+                <pic:pic>
+                  <pic:nvPicPr>
+                    <pic:cNvPr id="0" name="add7_equivalence.png"/>
+                    <pic:cNvPicPr/>
+                  </pic:nvPicPr>
+                  <pic:blipFill>
+                    <a:blip r:embed="rId29"/>
+                    <a:stretch>
+                      <a:fillRect/>
+                    </a:stretch>
+                  </pic:blipFill>
+                  <pic:spPr>
+                    <a:xfrm>
+                      <a:off x="0" y="0"/>
+                      <a:ext cx="5394960" cy="2744804"/>
+                    </a:xfrm>
+                    <a:prstGeom prst="rect"/>
+                  </pic:spPr>
+                </pic:pic>
+              </a:graphicData>
+            </a:graphic>
+          </wp:inline>
+        </w:drawing>
+      </w:r>
+    </w:p>
+    <w:p>
+      <w:pPr>
+        <w:spacing w:after="240"/>
+      </w:pPr>
+      <w:r>
+        <w:rPr>
+          <w:sz w:val="18"/>
+        </w:rPr>
+        <w:t>Fig. S21 Equivalence testing of the reported null results. Points give the difference of means between the classes, bars the bootstrap interval, and the shaded band the equivalence margin. Green marks quantities established as equivalent.</w:t>
+      </w:r>
+    </w:p>
+    <w:p>
+      <w:pPr>
+        <w:jc w:val="center"/>
+      </w:pPr>
+      <w:r>
+        <w:drawing>
+          <wp:inline xmlns:a="http://schemas.openxmlformats.org/drawingml/2006/main" xmlns:pic="http://schemas.openxmlformats.org/drawingml/2006/picture">
+            <wp:extent cx="5394960" cy="1849264"/>
+            <wp:docPr id="22" name="Picture 22"/>
+            <wp:cNvGraphicFramePr>
+              <a:graphicFrameLocks noChangeAspect="1"/>
+            </wp:cNvGraphicFramePr>
+            <a:graphic>
+              <a:graphicData uri="http://schemas.openxmlformats.org/drawingml/2006/picture">
+                <pic:pic>
+                  <pic:nvPicPr>
+                    <pic:cNvPr id="0" name="add7_channel_null.png"/>
+                    <pic:cNvPicPr/>
+                  </pic:nvPicPr>
+                  <pic:blipFill>
+                    <a:blip r:embed="rId30"/>
+                    <a:stretch>
+                      <a:fillRect/>
+                    </a:stretch>
+                  </pic:blipFill>
+                  <pic:spPr>
+                    <a:xfrm>
+                      <a:off x="0" y="0"/>
+                      <a:ext cx="5394960" cy="1849264"/>
+                    </a:xfrm>
+                    <a:prstGeom prst="rect"/>
+                  </pic:spPr>
+                </pic:pic>
+              </a:graphicData>
+            </a:graphic>
+          </wp:inline>
+        </w:drawing>
+      </w:r>
+    </w:p>
+    <w:p>
+      <w:pPr>
+        <w:spacing w:after="240"/>
+      </w:pPr>
+      <w:r>
+        <w:rPr>
+          <w:sz w:val="18"/>
+        </w:rPr>
+        <w:t>Fig. S22 Permutation null for readout-channel independence. (a) Antibody-antigen. (b) General protein-protein. The shaded band is the correlation expected if the moiety of a contact carried no grammar information.</w:t>
+      </w:r>
+    </w:p>
+    <w:p>
+      <w:pPr>
+        <w:jc w:val="center"/>
+      </w:pPr>
+      <w:r>
+        <w:drawing>
+          <wp:inline xmlns:a="http://schemas.openxmlformats.org/drawingml/2006/main" xmlns:pic="http://schemas.openxmlformats.org/drawingml/2006/picture">
+            <wp:extent cx="5394960" cy="1752996"/>
+            <wp:docPr id="23" name="Picture 23"/>
+            <wp:cNvGraphicFramePr>
+              <a:graphicFrameLocks noChangeAspect="1"/>
+            </wp:cNvGraphicFramePr>
+            <a:graphic>
+              <a:graphicData uri="http://schemas.openxmlformats.org/drawingml/2006/picture">
+                <pic:pic>
+                  <pic:nvPicPr>
+                    <pic:cNvPr id="0" name="add7_crystallisability.png"/>
+                    <pic:cNvPicPr/>
+                  </pic:nvPicPr>
+                  <pic:blipFill>
+                    <a:blip r:embed="rId31"/>
+                    <a:stretch>
+                      <a:fillRect/>
+                    </a:stretch>
+                  </pic:blipFill>
+                  <pic:spPr>
+                    <a:xfrm>
+                      <a:off x="0" y="0"/>
+                      <a:ext cx="5394960" cy="1752996"/>
+                    </a:xfrm>
+                    <a:prstGeom prst="rect"/>
+                  </pic:spPr>
+                </pic:pic>
+              </a:graphicData>
+            </a:graphic>
+          </wp:inline>
+        </w:drawing>
+      </w:r>
+    </w:p>
+    <w:p>
+      <w:pPr>
+        <w:spacing w:after="240"/>
+      </w:pPr>
+      <w:r>
+        <w:rPr>
+          <w:sz w:val="18"/>
+        </w:rPr>
+        <w:t>Fig. S23 Test of whether the interface geometry difference reflects crystallisability. (a) Radius of gyration and (b) planarity effects within quartiles of bound-protein length and within the high-resolution subset.</w:t>
       </w:r>
     </w:p>
     <w:p>

</xml_diff>